<commit_message>
machine-redaction: sommaire sans auto-entree, montants a droite, effectifs centres, footer elargi, keepNext
</commit_message>
<xml_diff>
--- a/machines/Modèles de docx/PTF - GINUTECH.docx
+++ b/machines/Modèles de docx/PTF - GINUTECH.docx
@@ -608,7 +608,6 @@
     </w:p>
     <w:p>
       <w:pPr>
-        <w:pStyle w:val="Heading1"/>
         <w:spacing w:after="200" w:before="0" w:lineRule="auto"/>
         <w:ind w:right="-561"/>
         <w:jc w:val="both"/>
@@ -1915,6 +1914,7 @@
     </w:p>
     <w:p>
       <w:pPr>
+        <w:keepNext w:val="1"/>
         <w:widowControl w:val="0"/>
         <w:numPr>
           <w:ilvl w:val="0"/>
@@ -2564,6 +2564,7 @@
           <w:p>
             <w:pPr>
               <w:ind w:right="13"/>
+              <w:jc w:val="right"/>
               <w:rPr>
                 <w:rFonts w:ascii="Candara" w:cs="Candara" w:eastAsia="Candara" w:hAnsi="Candara"/>
                 <w:sz w:val="24"/>
@@ -2649,6 +2650,7 @@
           <w:p>
             <w:pPr>
               <w:ind w:right="70"/>
+              <w:jc w:val="right"/>
               <w:rPr>
                 <w:rFonts w:ascii="Candara" w:cs="Candara" w:eastAsia="Candara" w:hAnsi="Candara"/>
                 <w:b w:val="1"/>
@@ -2991,7 +2993,7 @@
           <w:p>
             <w:pPr>
               <w:ind w:right="-14"/>
-              <w:jc w:val="both"/>
+              <w:jc w:val="center"/>
               <w:rPr>
                 <w:rFonts w:ascii="Candara" w:cs="Candara" w:eastAsia="Candara" w:hAnsi="Candara"/>
               </w:rPr>
@@ -6579,7 +6581,7 @@
       <w:footerReference r:id="rId17" w:type="first"/>
       <w:footerReference r:id="rId18" w:type="even"/>
       <w:pgSz w:h="16838" w:w="11906" w:orient="portrait"/>
-      <w:pgMar w:bottom="1440" w:top="1440" w:left="850" w:right="850" w:header="562" w:footer="562"/>
+      <w:pgMar w:bottom="1560" w:top="1440" w:left="850" w:right="850" w:header="562" w:footer="780"/>
       <w:pgNumType w:start="1"/>
       <w:titlePg w:val="1"/>
     </w:sectPr>

</xml_diff>

<commit_message>
machine-redaction: gantt depuis la base de faits (cellbg), bloc signature, cachet cote prestataire, porte 49 verifs
</commit_message>
<xml_diff>
--- a/machines/Modèles de docx/PTF - GINUTECH.docx
+++ b/machines/Modèles de docx/PTF - GINUTECH.docx
@@ -6507,7 +6507,7 @@
           <wp:anchor allowOverlap="1" behindDoc="0" distB="0" distT="0" distL="0" distR="0" hidden="0" layoutInCell="1" locked="0" relativeHeight="0" simplePos="0">
             <wp:simplePos x="0" y="0"/>
             <wp:positionH relativeFrom="column">
-              <wp:posOffset>4137896</wp:posOffset>
+              <wp:posOffset>600075</wp:posOffset>
             </wp:positionH>
             <wp:positionV relativeFrom="paragraph">
               <wp:posOffset>239025</wp:posOffset>
@@ -6573,6 +6573,67 @@
         </w:rPr>
       </w:r>
     </w:p>
+    <w:p/>
+    <w:tbl>
+      <w:tblPr>
+        <w:tblW w:type="auto" w:w="0"/>
+        <w:tblLook w:firstColumn="1" w:firstRow="1" w:lastColumn="0" w:lastRow="0" w:noHBand="0" w:noVBand="1" w:val="04A0"/>
+      </w:tblPr>
+      <w:tblGrid>
+        <w:gridCol w:w="5103"/>
+        <w:gridCol w:w="5103"/>
+      </w:tblGrid>
+      <w:tr>
+        <w:tc>
+          <w:tcPr>
+            <w:tcW w:type="dxa" w:w="5103"/>
+          </w:tcPr>
+          <w:p>
+            <w:r>
+              <w:rPr>
+                <w:b/>
+              </w:rPr>
+              <w:t>Pour GINUTECH,</w:t>
+            </w:r>
+          </w:p>
+        </w:tc>
+        <w:tc>
+          <w:tcPr>
+            <w:tcW w:type="dxa" w:w="5103"/>
+          </w:tcPr>
+          <w:p>
+            <w:r>
+              <w:rPr>
+                <w:b/>
+              </w:rPr>
+              <w:t>Pour {client_name},</w:t>
+            </w:r>
+          </w:p>
+        </w:tc>
+      </w:tr>
+      <w:tr>
+        <w:tc>
+          <w:tcPr>
+            <w:tcW w:type="dxa" w:w="5103"/>
+          </w:tcPr>
+          <w:p>
+            <w:r>
+              <w:t>M. Steve FASSEU — CEO</w:t>
+            </w:r>
+          </w:p>
+        </w:tc>
+        <w:tc>
+          <w:tcPr>
+            <w:tcW w:type="dxa" w:w="5103"/>
+          </w:tcPr>
+          <w:p>
+            <w:r>
+              <w:t>« Bon pour accord » — nom, fonction et signature</w:t>
+            </w:r>
+          </w:p>
+        </w:tc>
+      </w:tr>
+    </w:tbl>
     <w:sectPr>
       <w:headerReference r:id="rId13" w:type="default"/>
       <w:headerReference r:id="rId14" w:type="first"/>

</xml_diff>

<commit_message>
machine-redaction: contrat de forme (police unique, palette, echelle, metadonnees), page 3 comblee, porte 52 verifs
</commit_message>
<xml_diff>
--- a/machines/Modèles de docx/PTF - GINUTECH.docx
+++ b/machines/Modèles de docx/PTF - GINUTECH.docx
@@ -31,8 +31,8 @@
           <w:bCs w:val="1"/>
           <w:smallCaps w:val="1"/>
           <w:color w:val="0d8a52"/>
-          <w:sz w:val="22"/>
-          <w:szCs w:val="22"/>
+          <w:sz w:val="20"/>
+          <w:szCs w:val="20"/>
           <w:rtl w:val="0"/>
         </w:rPr>
         <w:t xml:space="preserve">PROPOSITION COMMERCIALE</w:t>
@@ -160,8 +160,8 @@
         <w:rPr>
           <w:rFonts w:ascii="Candara" w:cs="Candara" w:eastAsia="Candara" w:hAnsi="Candara"/>
           <w:color w:val="666666"/>
-          <w:sz w:val="22"/>
-          <w:szCs w:val="22"/>
+          <w:sz w:val="20"/>
+          <w:szCs w:val="20"/>
           <w:rtl w:val="0"/>
         </w:rPr>
         <w:t xml:space="preserve">{project_title}</w:t>
@@ -220,8 +220,8 @@
                 <w:b w:val="1"/>
                 <w:bCs w:val="1"/>
                 <w:color w:val="1f5faf"/>
-                <w:sz w:val="21"/>
-                <w:szCs w:val="21"/>
+                <w:sz w:val="20"/>
+                <w:szCs w:val="20"/>
                 <w:rtl w:val="0"/>
               </w:rPr>
               <w:t xml:space="preserve">Client</w:t>
@@ -247,8 +247,8 @@
             <w:r>
               <w:rPr>
                 <w:rFonts w:ascii="Candara" w:cs="Candara" w:eastAsia="Candara" w:hAnsi="Candara"/>
-                <w:sz w:val="21"/>
-                <w:szCs w:val="21"/>
+                <w:sz w:val="20"/>
+                <w:szCs w:val="20"/>
                 <w:rtl w:val="0"/>
               </w:rPr>
               <w:t xml:space="preserve">{client_name}</w:t>
@@ -283,8 +283,8 @@
                 <w:b w:val="1"/>
                 <w:bCs w:val="1"/>
                 <w:color w:val="1f5faf"/>
-                <w:sz w:val="21"/>
-                <w:szCs w:val="21"/>
+                <w:sz w:val="20"/>
+                <w:szCs w:val="20"/>
                 <w:rtl w:val="0"/>
               </w:rPr>
               <w:t xml:space="preserve">Projet</w:t>
@@ -310,8 +310,8 @@
             <w:r>
               <w:rPr>
                 <w:rFonts w:ascii="Candara" w:cs="Candara" w:eastAsia="Candara" w:hAnsi="Candara"/>
-                <w:sz w:val="21"/>
-                <w:szCs w:val="21"/>
+                <w:sz w:val="20"/>
+                <w:szCs w:val="20"/>
                 <w:rtl w:val="0"/>
               </w:rPr>
               <w:t xml:space="preserve">{project_title}</w:t>
@@ -346,8 +346,8 @@
                 <w:b w:val="1"/>
                 <w:bCs w:val="1"/>
                 <w:color w:val="1f5faf"/>
-                <w:sz w:val="21"/>
-                <w:szCs w:val="21"/>
+                <w:sz w:val="20"/>
+                <w:szCs w:val="20"/>
                 <w:rtl w:val="0"/>
               </w:rPr>
               <w:t xml:space="preserve">Montant total</w:t>
@@ -373,8 +373,8 @@
             <w:r>
               <w:rPr>
                 <w:rFonts w:ascii="Candara" w:cs="Candara" w:eastAsia="Candara" w:hAnsi="Candara"/>
-                <w:sz w:val="21"/>
-                <w:szCs w:val="21"/>
+                <w:sz w:val="20"/>
+                <w:szCs w:val="20"/>
                 <w:rtl w:val="0"/>
               </w:rPr>
               <w:t xml:space="preserve">{total_amount_text} ({total_amount_num}) FCFA HT</w:t>
@@ -409,8 +409,8 @@
                 <w:b w:val="1"/>
                 <w:bCs w:val="1"/>
                 <w:color w:val="1f5faf"/>
-                <w:sz w:val="21"/>
-                <w:szCs w:val="21"/>
+                <w:sz w:val="20"/>
+                <w:szCs w:val="20"/>
                 <w:rtl w:val="0"/>
               </w:rPr>
               <w:t xml:space="preserve">Date</w:t>
@@ -436,8 +436,8 @@
             <w:r>
               <w:rPr>
                 <w:rFonts w:ascii="Candara" w:cs="Candara" w:eastAsia="Candara" w:hAnsi="Candara"/>
-                <w:sz w:val="21"/>
-                <w:szCs w:val="21"/>
+                <w:sz w:val="20"/>
+                <w:szCs w:val="20"/>
                 <w:rtl w:val="0"/>
               </w:rPr>
               <w:t xml:space="preserve">{date}</w:t>
@@ -472,8 +472,8 @@
                 <w:b w:val="1"/>
                 <w:bCs w:val="1"/>
                 <w:color w:val="1f5faf"/>
-                <w:sz w:val="21"/>
-                <w:szCs w:val="21"/>
+                <w:sz w:val="20"/>
+                <w:szCs w:val="20"/>
                 <w:rtl w:val="0"/>
               </w:rPr>
               <w:t xml:space="preserve">Statut</w:t>
@@ -499,8 +499,8 @@
             <w:r>
               <w:rPr>
                 <w:rFonts w:ascii="Candara" w:cs="Candara" w:eastAsia="Candara" w:hAnsi="Candara"/>
-                <w:sz w:val="21"/>
-                <w:szCs w:val="21"/>
+                <w:sz w:val="20"/>
+                <w:szCs w:val="20"/>
                 <w:rtl w:val="0"/>
               </w:rPr>
               <w:t xml:space="preserve">Confidentiel</w:t>
@@ -579,7 +579,7 @@
                 <w:szCs w:val="20"/>
                 <w:rtl w:val="0"/>
               </w:rPr>
-              <w:t xml:space="preserve">Document commercial - Usage interne et client</w:t>
+              <w:t xml:space="preserve">Document commercial — Usage interne et client</w:t>
             </w:r>
             <w:r>
               <w:rPr>
@@ -1343,6 +1343,7 @@
     </w:p>
     <w:p>
       <w:pPr>
+        <w:jc w:val="both"/>
         <w:rPr>
           <w:rFonts w:ascii="Candara" w:cs="Candara" w:eastAsia="Candara" w:hAnsi="Candara"/>
         </w:rPr>
@@ -1454,6 +1455,7 @@
         </w:numPr>
         <w:spacing w:after="240" w:lineRule="auto"/>
         <w:ind w:left="720" w:right="-561" w:hanging="360"/>
+        <w:jc w:val="both"/>
         <w:rPr>
           <w:rFonts w:ascii="Candara" w:cs="Candara" w:eastAsia="Candara" w:hAnsi="Candara"/>
           <w:sz w:val="24"/>
@@ -1551,9 +1553,7 @@
         </w:rPr>
         <w:t xml:space="preserve">pour catalyser votre croissance et vous ouvrir les portes de l’innovation.</w:t>
       </w:r>
-      <w:r>
-        <w:br w:type="page"/>
-      </w:r>
+      <w:r/>
       <w:r>
         <w:rPr>
           <w:rtl w:val="0"/>
@@ -1664,8 +1664,8 @@
           <w:rFonts w:ascii="Candara" w:cs="Candara" w:eastAsia="Candara" w:hAnsi="Candara"/>
           <w:b w:val="1"/>
           <w:bCs w:val="1"/>
-          <w:sz w:val="34"/>
-          <w:szCs w:val="34"/>
+          <w:sz w:val="36"/>
+          <w:szCs w:val="36"/>
         </w:rPr>
       </w:pPr>
       <w:bookmarkStart w:colFirst="0" w:colLast="0" w:name="_heading=h.h01ypdrppoiy" w:id="3"/>
@@ -1675,8 +1675,8 @@
           <w:rFonts w:ascii="Candara" w:cs="Candara" w:eastAsia="Candara" w:hAnsi="Candara"/>
           <w:b w:val="1"/>
           <w:bCs w:val="1"/>
-          <w:sz w:val="34"/>
-          <w:szCs w:val="34"/>
+          <w:sz w:val="36"/>
+          <w:szCs w:val="36"/>
           <w:rtl w:val="0"/>
         </w:rPr>
         <w:t xml:space="preserve">Besoins fonctionnels couverts</w:t>
@@ -1891,8 +1891,8 @@
           <w:rFonts w:ascii="Candara" w:cs="Candara" w:eastAsia="Candara" w:hAnsi="Candara"/>
           <w:b w:val="1"/>
           <w:bCs w:val="1"/>
-          <w:sz w:val="34"/>
-          <w:szCs w:val="34"/>
+          <w:sz w:val="36"/>
+          <w:szCs w:val="36"/>
         </w:rPr>
       </w:pPr>
       <w:bookmarkStart w:colFirst="0" w:colLast="0" w:name="_heading=h.wqnnm8slydr" w:id="5"/>
@@ -1926,8 +1926,8 @@
           <w:rFonts w:ascii="Candara" w:cs="Candara" w:eastAsia="Candara" w:hAnsi="Candara"/>
           <w:b w:val="1"/>
           <w:bCs w:val="1"/>
-          <w:sz w:val="26"/>
-          <w:szCs w:val="26"/>
+          <w:sz w:val="24"/>
+          <w:szCs w:val="24"/>
         </w:rPr>
       </w:pPr>
       <w:r>
@@ -1984,8 +1984,8 @@
           <w:rFonts w:ascii="Candara" w:cs="Candara" w:eastAsia="Candara" w:hAnsi="Candara"/>
           <w:b w:val="1"/>
           <w:bCs w:val="1"/>
-          <w:sz w:val="34"/>
-          <w:szCs w:val="34"/>
+          <w:sz w:val="36"/>
+          <w:szCs w:val="36"/>
         </w:rPr>
       </w:pPr>
       <w:r>
@@ -2137,6 +2137,7 @@
     </w:p>
     <w:p>
       <w:pPr>
+        <w:jc w:val="both"/>
         <w:rPr>
           <w:rFonts w:ascii="Candara" w:cs="Candara" w:eastAsia="Candara" w:hAnsi="Candara"/>
           <w:b w:val="1"/>
@@ -2194,8 +2195,8 @@
           <w:rFonts w:ascii="Candara" w:cs="Candara" w:eastAsia="Candara" w:hAnsi="Candara"/>
           <w:b w:val="1"/>
           <w:bCs w:val="1"/>
-          <w:sz w:val="30"/>
-          <w:szCs w:val="30"/>
+          <w:sz w:val="28"/>
+          <w:szCs w:val="28"/>
         </w:rPr>
       </w:pPr>
       <w:bookmarkStart w:colFirst="0" w:colLast="0" w:name="_heading=h.anaurzrwvyn9" w:id="9"/>
@@ -2265,8 +2266,8 @@
           <w:rFonts w:ascii="Candara" w:cs="Candara" w:eastAsia="Candara" w:hAnsi="Candara"/>
           <w:b w:val="1"/>
           <w:bCs w:val="1"/>
-          <w:sz w:val="26"/>
-          <w:szCs w:val="26"/>
+          <w:sz w:val="24"/>
+          <w:szCs w:val="24"/>
         </w:rPr>
       </w:pPr>
       <w:r>
@@ -2327,7 +2328,7 @@
               <w:bottom w:color="000000" w:space="0" w:sz="8" w:val="single"/>
               <w:right w:color="000000" w:space="0" w:sz="8" w:val="single"/>
             </w:tcBorders>
-            <w:shd w:fill="339933" w:val="clear"/>
+            <w:shd w:fill="0d8a52" w:val="clear"/>
             <w:tcMar>
               <w:top w:w="100.0" w:type="dxa"/>
               <w:left w:w="100.0" w:type="dxa"/>
@@ -2369,7 +2370,7 @@
               <w:bottom w:color="000000" w:space="0" w:sz="8" w:val="single"/>
               <w:right w:color="000000" w:space="0" w:sz="8" w:val="single"/>
             </w:tcBorders>
-            <w:shd w:fill="339933" w:val="clear"/>
+            <w:shd w:fill="0d8a52" w:val="clear"/>
             <w:tcMar>
               <w:top w:w="100.0" w:type="dxa"/>
               <w:left w:w="100.0" w:type="dxa"/>
@@ -2411,7 +2412,7 @@
               <w:bottom w:color="000000" w:space="0" w:sz="8" w:val="single"/>
               <w:right w:color="000000" w:space="0" w:sz="8" w:val="single"/>
             </w:tcBorders>
-            <w:shd w:fill="339933" w:val="clear"/>
+            <w:shd w:fill="0d8a52" w:val="clear"/>
             <w:tcMar>
               <w:top w:w="100.0" w:type="dxa"/>
               <w:left w:w="100.0" w:type="dxa"/>
@@ -2598,7 +2599,7 @@
               <w:bottom w:color="000000" w:space="0" w:sz="8" w:val="single"/>
               <w:right w:color="000000" w:space="0" w:sz="8" w:val="single"/>
             </w:tcBorders>
-            <w:shd w:fill="b7b7b7" w:val="clear"/>
+            <w:shd w:fill="cccccc" w:val="clear"/>
             <w:tcMar>
               <w:top w:w="100.0" w:type="dxa"/>
               <w:left w:w="100.0" w:type="dxa"/>
@@ -2639,7 +2640,7 @@
               <w:bottom w:color="000000" w:space="0" w:sz="8" w:val="single"/>
               <w:right w:color="000000" w:space="0" w:sz="8" w:val="single"/>
             </w:tcBorders>
-            <w:shd w:fill="b7b7b7" w:val="clear"/>
+            <w:shd w:fill="cccccc" w:val="clear"/>
             <w:tcMar>
               <w:top w:w="100.0" w:type="dxa"/>
               <w:left w:w="100.0" w:type="dxa"/>
@@ -2780,7 +2781,7 @@
               <w:bottom w:color="000000" w:space="0" w:sz="8" w:val="single"/>
               <w:right w:color="000000" w:space="0" w:sz="8" w:val="single"/>
             </w:tcBorders>
-            <w:shd w:fill="339933" w:val="clear"/>
+            <w:shd w:fill="0d8a52" w:val="clear"/>
             <w:tcMar>
               <w:top w:w="100.0" w:type="dxa"/>
               <w:left w:w="100.0" w:type="dxa"/>
@@ -2822,7 +2823,7 @@
               <w:bottom w:color="000000" w:space="0" w:sz="8" w:val="single"/>
               <w:right w:color="000000" w:space="0" w:sz="8" w:val="single"/>
             </w:tcBorders>
-            <w:shd w:fill="339933" w:val="clear"/>
+            <w:shd w:fill="0d8a52" w:val="clear"/>
             <w:tcMar>
               <w:top w:w="100.0" w:type="dxa"/>
               <w:left w:w="100.0" w:type="dxa"/>
@@ -2864,7 +2865,7 @@
               <w:bottom w:color="000000" w:space="0" w:sz="8" w:val="single"/>
               <w:right w:color="000000" w:space="0" w:sz="8" w:val="single"/>
             </w:tcBorders>
-            <w:shd w:fill="339933" w:val="clear"/>
+            <w:shd w:fill="0d8a52" w:val="clear"/>
             <w:tcMar>
               <w:top w:w="100.0" w:type="dxa"/>
               <w:left w:w="100.0" w:type="dxa"/>
@@ -3037,8 +3038,8 @@
           <w:rFonts w:ascii="Candara" w:cs="Candara" w:eastAsia="Candara" w:hAnsi="Candara"/>
           <w:b w:val="1"/>
           <w:bCs w:val="1"/>
-          <w:sz w:val="34"/>
-          <w:szCs w:val="34"/>
+          <w:sz w:val="36"/>
+          <w:szCs w:val="36"/>
         </w:rPr>
       </w:pPr>
       <w:bookmarkStart w:colFirst="0" w:colLast="0" w:name="_heading=h.rgsfwzdrmwv6" w:id="12"/>
@@ -3146,7 +3147,7 @@
               <w:bottom w:color="666666" w:space="0" w:sz="8" w:val="single"/>
               <w:right w:color="000000" w:space="0" w:sz="8" w:val="single"/>
             </w:tcBorders>
-            <w:shd w:fill="339933" w:val="clear"/>
+            <w:shd w:fill="0d8a52" w:val="clear"/>
             <w:tcMar>
               <w:top w:w="0.0" w:type="dxa"/>
               <w:left w:w="0.0" w:type="dxa"/>
@@ -3175,7 +3176,7 @@
                 <w:color w:val="ffffff"/>
                 <w:rtl w:val="0"/>
               </w:rPr>
-              <w:t xml:space="preserve">Durée (en semaine)</w:t>
+              <w:t xml:space="preserve">Durée (en semaines)</w:t>
             </w:r>
           </w:p>
         </w:tc>
@@ -3595,7 +3596,7 @@
               <w:bottom w:color="666666" w:space="0" w:sz="8" w:val="single"/>
               <w:right w:color="666666" w:space="0" w:sz="8" w:val="single"/>
             </w:tcBorders>
-            <w:shd w:fill="339933" w:val="clear"/>
+            <w:shd w:fill="0d8a52" w:val="clear"/>
             <w:tcMar>
               <w:top w:w="99.0" w:type="dxa"/>
               <w:left w:w="99.0" w:type="dxa"/>
@@ -3628,7 +3629,7 @@
               <w:bottom w:color="666666" w:space="0" w:sz="8" w:val="single"/>
               <w:right w:color="666666" w:space="0" w:sz="8" w:val="single"/>
             </w:tcBorders>
-            <w:shd w:fill="339933" w:val="clear"/>
+            <w:shd w:fill="0d8a52" w:val="clear"/>
             <w:tcMar>
               <w:top w:w="99.0" w:type="dxa"/>
               <w:left w:w="99.0" w:type="dxa"/>
@@ -3973,7 +3974,7 @@
               <w:bottom w:color="666666" w:space="0" w:sz="8" w:val="single"/>
               <w:right w:color="666666" w:space="0" w:sz="8" w:val="single"/>
             </w:tcBorders>
-            <w:shd w:fill="339933" w:val="clear"/>
+            <w:shd w:fill="0d8a52" w:val="clear"/>
             <w:tcMar>
               <w:top w:w="99.0" w:type="dxa"/>
               <w:left w:w="99.0" w:type="dxa"/>
@@ -4006,7 +4007,7 @@
               <w:bottom w:color="666666" w:space="0" w:sz="8" w:val="single"/>
               <w:right w:color="666666" w:space="0" w:sz="8" w:val="single"/>
             </w:tcBorders>
-            <w:shd w:fill="339933" w:val="clear"/>
+            <w:shd w:fill="0d8a52" w:val="clear"/>
             <w:tcMar>
               <w:top w:w="99.0" w:type="dxa"/>
               <w:left w:w="99.0" w:type="dxa"/>
@@ -4313,7 +4314,7 @@
               <w:bottom w:color="666666" w:space="0" w:sz="8" w:val="single"/>
               <w:right w:color="666666" w:space="0" w:sz="8" w:val="single"/>
             </w:tcBorders>
-            <w:shd w:fill="339933" w:val="clear"/>
+            <w:shd w:fill="0d8a52" w:val="clear"/>
             <w:tcMar>
               <w:top w:w="99.0" w:type="dxa"/>
               <w:left w:w="99.0" w:type="dxa"/>
@@ -4620,7 +4621,7 @@
               <w:bottom w:color="666666" w:space="0" w:sz="8" w:val="single"/>
               <w:right w:color="666666" w:space="0" w:sz="8" w:val="single"/>
             </w:tcBorders>
-            <w:shd w:fill="339933" w:val="clear"/>
+            <w:shd w:fill="0d8a52" w:val="clear"/>
             <w:tcMar>
               <w:top w:w="99.0" w:type="dxa"/>
               <w:left w:w="99.0" w:type="dxa"/>
@@ -4653,7 +4654,7 @@
               <w:bottom w:color="666666" w:space="0" w:sz="8" w:val="single"/>
               <w:right w:color="666666" w:space="0" w:sz="8" w:val="single"/>
             </w:tcBorders>
-            <w:shd w:fill="339933" w:val="clear"/>
+            <w:shd w:fill="0d8a52" w:val="clear"/>
             <w:tcMar>
               <w:top w:w="99.0" w:type="dxa"/>
               <w:left w:w="99.0" w:type="dxa"/>
@@ -4686,7 +4687,7 @@
               <w:bottom w:color="666666" w:space="0" w:sz="8" w:val="single"/>
               <w:right w:color="666666" w:space="0" w:sz="8" w:val="single"/>
             </w:tcBorders>
-            <w:shd w:fill="339933" w:val="clear"/>
+            <w:shd w:fill="0d8a52" w:val="clear"/>
             <w:tcMar>
               <w:top w:w="99.0" w:type="dxa"/>
               <w:left w:w="99.0" w:type="dxa"/>
@@ -4993,7 +4994,7 @@
               <w:bottom w:color="666666" w:space="0" w:sz="8" w:val="single"/>
               <w:right w:color="666666" w:space="0" w:sz="8" w:val="single"/>
             </w:tcBorders>
-            <w:shd w:fill="339933" w:val="clear"/>
+            <w:shd w:fill="0d8a52" w:val="clear"/>
             <w:tcMar>
               <w:top w:w="99.0" w:type="dxa"/>
               <w:left w:w="99.0" w:type="dxa"/>
@@ -5026,7 +5027,7 @@
               <w:bottom w:color="666666" w:space="0" w:sz="8" w:val="single"/>
               <w:right w:color="666666" w:space="0" w:sz="8" w:val="single"/>
             </w:tcBorders>
-            <w:shd w:fill="339933" w:val="clear"/>
+            <w:shd w:fill="0d8a52" w:val="clear"/>
             <w:tcMar>
               <w:top w:w="99.0" w:type="dxa"/>
               <w:left w:w="99.0" w:type="dxa"/>
@@ -5059,7 +5060,7 @@
               <w:bottom w:color="666666" w:space="0" w:sz="8" w:val="single"/>
               <w:right w:color="666666" w:space="0" w:sz="8" w:val="single"/>
             </w:tcBorders>
-            <w:shd w:fill="339933" w:val="clear"/>
+            <w:shd w:fill="0d8a52" w:val="clear"/>
             <w:tcMar>
               <w:top w:w="99.0" w:type="dxa"/>
               <w:left w:w="99.0" w:type="dxa"/>
@@ -5334,7 +5335,7 @@
               <w:bottom w:color="666666" w:space="0" w:sz="8" w:val="single"/>
               <w:right w:color="666666" w:space="0" w:sz="8" w:val="single"/>
             </w:tcBorders>
-            <w:shd w:fill="339933" w:val="clear"/>
+            <w:shd w:fill="0d8a52" w:val="clear"/>
             <w:tcMar>
               <w:top w:w="99.0" w:type="dxa"/>
               <w:left w:w="99.0" w:type="dxa"/>
@@ -5367,7 +5368,7 @@
               <w:bottom w:color="666666" w:space="0" w:sz="8" w:val="single"/>
               <w:right w:color="666666" w:space="0" w:sz="8" w:val="single"/>
             </w:tcBorders>
-            <w:shd w:fill="339933" w:val="clear"/>
+            <w:shd w:fill="0d8a52" w:val="clear"/>
             <w:tcMar>
               <w:top w:w="99.0" w:type="dxa"/>
               <w:left w:w="99.0" w:type="dxa"/>
@@ -5576,7 +5577,7 @@
         </w:trPr>
         <w:tc>
           <w:tcPr>
-            <w:shd w:fill="339933" w:val="clear"/>
+            <w:shd w:fill="0d8a52" w:val="clear"/>
             <w:tcMar>
               <w:top w:w="100.0" w:type="dxa"/>
               <w:left w:w="100.0" w:type="dxa"/>
@@ -5615,7 +5616,7 @@
         </w:tc>
         <w:tc>
           <w:tcPr>
-            <w:shd w:fill="339933" w:val="clear"/>
+            <w:shd w:fill="0d8a52" w:val="clear"/>
             <w:tcMar>
               <w:top w:w="100.0" w:type="dxa"/>
               <w:left w:w="100.0" w:type="dxa"/>
@@ -5766,8 +5767,8 @@
               <w:ind w:left="425" w:right="76" w:hanging="285"/>
               <w:rPr>
                 <w:rFonts w:ascii="Candara" w:cs="Candara" w:eastAsia="Candara" w:hAnsi="Candara"/>
-                <w:sz w:val="26"/>
-                <w:szCs w:val="26"/>
+                <w:sz w:val="24"/>
+                <w:szCs w:val="24"/>
               </w:rPr>
             </w:pPr>
             <w:r>
@@ -6086,8 +6087,8 @@
               <w:ind w:left="425" w:right="76" w:hanging="285"/>
               <w:rPr>
                 <w:rFonts w:ascii="Candara" w:cs="Candara" w:eastAsia="Candara" w:hAnsi="Candara"/>
-                <w:sz w:val="26"/>
-                <w:szCs w:val="26"/>
+                <w:sz w:val="24"/>
+                <w:szCs w:val="24"/>
               </w:rPr>
             </w:pPr>
             <w:r>
@@ -6246,8 +6247,8 @@
               <w:ind w:left="425" w:right="76" w:hanging="285"/>
               <w:rPr>
                 <w:rFonts w:ascii="Candara" w:cs="Candara" w:eastAsia="Candara" w:hAnsi="Candara"/>
-                <w:sz w:val="26"/>
-                <w:szCs w:val="26"/>
+                <w:sz w:val="24"/>
+                <w:szCs w:val="24"/>
               </w:rPr>
             </w:pPr>
             <w:r>
@@ -6378,10 +6379,11 @@
                 <w:tab w:val="left" w:leader="none" w:pos="960"/>
               </w:tabs>
               <w:ind w:left="425" w:right="76" w:hanging="285"/>
-              <w:rPr>
-                <w:rFonts w:ascii="Candara" w:cs="Candara" w:eastAsia="Candara" w:hAnsi="Candara"/>
-                <w:sz w:val="26"/>
-                <w:szCs w:val="26"/>
+              <w:jc w:val="both"/>
+              <w:rPr>
+                <w:rFonts w:ascii="Candara" w:cs="Candara" w:eastAsia="Candara" w:hAnsi="Candara"/>
+                <w:sz w:val="24"/>
+                <w:szCs w:val="24"/>
               </w:rPr>
             </w:pPr>
             <w:r>
@@ -6991,7 +6993,7 @@
     <w:lvl w:ilvl="0">
       <w:start w:val="1"/>
       <w:numFmt w:val="bullet"/>
-      <w:lvlText w:val="●"/>
+      <w:lvlText w:val="•"/>
       <w:lvlJc w:val="left"/>
       <w:pPr>
         <w:ind w:left="720" w:hanging="360"/>
@@ -7003,7 +7005,7 @@
     <w:lvl w:ilvl="1">
       <w:start w:val="1"/>
       <w:numFmt w:val="bullet"/>
-      <w:lvlText w:val="○"/>
+      <w:lvlText w:val="•"/>
       <w:lvlJc w:val="left"/>
       <w:pPr>
         <w:ind w:left="1440" w:hanging="360"/>
@@ -7015,7 +7017,7 @@
     <w:lvl w:ilvl="2">
       <w:start w:val="1"/>
       <w:numFmt w:val="bullet"/>
-      <w:lvlText w:val="■"/>
+      <w:lvlText w:val="•"/>
       <w:lvlJc w:val="left"/>
       <w:pPr>
         <w:ind w:left="2160" w:hanging="360"/>
@@ -7027,7 +7029,7 @@
     <w:lvl w:ilvl="3">
       <w:start w:val="1"/>
       <w:numFmt w:val="bullet"/>
-      <w:lvlText w:val="●"/>
+      <w:lvlText w:val="•"/>
       <w:lvlJc w:val="left"/>
       <w:pPr>
         <w:ind w:left="2880" w:hanging="360"/>
@@ -7039,7 +7041,7 @@
     <w:lvl w:ilvl="4">
       <w:start w:val="1"/>
       <w:numFmt w:val="bullet"/>
-      <w:lvlText w:val="○"/>
+      <w:lvlText w:val="•"/>
       <w:lvlJc w:val="left"/>
       <w:pPr>
         <w:ind w:left="3600" w:hanging="360"/>
@@ -7051,7 +7053,7 @@
     <w:lvl w:ilvl="5">
       <w:start w:val="1"/>
       <w:numFmt w:val="bullet"/>
-      <w:lvlText w:val="■"/>
+      <w:lvlText w:val="•"/>
       <w:lvlJc w:val="left"/>
       <w:pPr>
         <w:ind w:left="4320" w:hanging="360"/>
@@ -7063,7 +7065,7 @@
     <w:lvl w:ilvl="6">
       <w:start w:val="1"/>
       <w:numFmt w:val="bullet"/>
-      <w:lvlText w:val="●"/>
+      <w:lvlText w:val="•"/>
       <w:lvlJc w:val="left"/>
       <w:pPr>
         <w:ind w:left="5040" w:hanging="360"/>
@@ -7075,7 +7077,7 @@
     <w:lvl w:ilvl="7">
       <w:start w:val="1"/>
       <w:numFmt w:val="bullet"/>
-      <w:lvlText w:val="○"/>
+      <w:lvlText w:val="•"/>
       <w:lvlJc w:val="left"/>
       <w:pPr>
         <w:ind w:left="5760" w:hanging="360"/>
@@ -7087,7 +7089,7 @@
     <w:lvl w:ilvl="8">
       <w:start w:val="1"/>
       <w:numFmt w:val="bullet"/>
-      <w:lvlText w:val="■"/>
+      <w:lvlText w:val="•"/>
       <w:lvlJc w:val="left"/>
       <w:pPr>
         <w:ind w:left="6480" w:hanging="360"/>
@@ -7101,7 +7103,7 @@
     <w:lvl w:ilvl="0">
       <w:start w:val="1"/>
       <w:numFmt w:val="bullet"/>
-      <w:lvlText w:val="●"/>
+      <w:lvlText w:val="•"/>
       <w:lvlJc w:val="left"/>
       <w:pPr>
         <w:ind w:left="720" w:hanging="360"/>
@@ -7113,7 +7115,7 @@
     <w:lvl w:ilvl="1">
       <w:start w:val="1"/>
       <w:numFmt w:val="bullet"/>
-      <w:lvlText w:val="○"/>
+      <w:lvlText w:val="•"/>
       <w:lvlJc w:val="left"/>
       <w:pPr>
         <w:ind w:left="1440" w:hanging="360"/>
@@ -7125,7 +7127,7 @@
     <w:lvl w:ilvl="2">
       <w:start w:val="1"/>
       <w:numFmt w:val="bullet"/>
-      <w:lvlText w:val="■"/>
+      <w:lvlText w:val="•"/>
       <w:lvlJc w:val="left"/>
       <w:pPr>
         <w:ind w:left="2160" w:hanging="360"/>
@@ -7137,7 +7139,7 @@
     <w:lvl w:ilvl="3">
       <w:start w:val="1"/>
       <w:numFmt w:val="bullet"/>
-      <w:lvlText w:val="●"/>
+      <w:lvlText w:val="•"/>
       <w:lvlJc w:val="left"/>
       <w:pPr>
         <w:ind w:left="2880" w:hanging="360"/>
@@ -7149,7 +7151,7 @@
     <w:lvl w:ilvl="4">
       <w:start w:val="1"/>
       <w:numFmt w:val="bullet"/>
-      <w:lvlText w:val="○"/>
+      <w:lvlText w:val="•"/>
       <w:lvlJc w:val="left"/>
       <w:pPr>
         <w:ind w:left="3600" w:hanging="360"/>
@@ -7161,7 +7163,7 @@
     <w:lvl w:ilvl="5">
       <w:start w:val="1"/>
       <w:numFmt w:val="bullet"/>
-      <w:lvlText w:val="■"/>
+      <w:lvlText w:val="•"/>
       <w:lvlJc w:val="left"/>
       <w:pPr>
         <w:ind w:left="4320" w:hanging="360"/>
@@ -7173,7 +7175,7 @@
     <w:lvl w:ilvl="6">
       <w:start w:val="1"/>
       <w:numFmt w:val="bullet"/>
-      <w:lvlText w:val="●"/>
+      <w:lvlText w:val="•"/>
       <w:lvlJc w:val="left"/>
       <w:pPr>
         <w:ind w:left="5040" w:hanging="360"/>
@@ -7185,7 +7187,7 @@
     <w:lvl w:ilvl="7">
       <w:start w:val="1"/>
       <w:numFmt w:val="bullet"/>
-      <w:lvlText w:val="○"/>
+      <w:lvlText w:val="•"/>
       <w:lvlJc w:val="left"/>
       <w:pPr>
         <w:ind w:left="5760" w:hanging="360"/>
@@ -7197,7 +7199,7 @@
     <w:lvl w:ilvl="8">
       <w:start w:val="1"/>
       <w:numFmt w:val="bullet"/>
-      <w:lvlText w:val="■"/>
+      <w:lvlText w:val="•"/>
       <w:lvlJc w:val="left"/>
       <w:pPr>
         <w:ind w:left="6480" w:hanging="360"/>
@@ -7321,7 +7323,7 @@
     <w:lvl w:ilvl="0">
       <w:start w:val="1"/>
       <w:numFmt w:val="bullet"/>
-      <w:lvlText w:val="●"/>
+      <w:lvlText w:val="•"/>
       <w:lvlJc w:val="left"/>
       <w:pPr>
         <w:ind w:left="720" w:hanging="360"/>
@@ -7333,7 +7335,7 @@
     <w:lvl w:ilvl="1">
       <w:start w:val="1"/>
       <w:numFmt w:val="bullet"/>
-      <w:lvlText w:val="○"/>
+      <w:lvlText w:val="•"/>
       <w:lvlJc w:val="left"/>
       <w:pPr>
         <w:ind w:left="1440" w:hanging="360"/>
@@ -7345,7 +7347,7 @@
     <w:lvl w:ilvl="2">
       <w:start w:val="1"/>
       <w:numFmt w:val="bullet"/>
-      <w:lvlText w:val="■"/>
+      <w:lvlText w:val="•"/>
       <w:lvlJc w:val="left"/>
       <w:pPr>
         <w:ind w:left="2160" w:hanging="360"/>
@@ -7357,7 +7359,7 @@
     <w:lvl w:ilvl="3">
       <w:start w:val="1"/>
       <w:numFmt w:val="bullet"/>
-      <w:lvlText w:val="●"/>
+      <w:lvlText w:val="•"/>
       <w:lvlJc w:val="left"/>
       <w:pPr>
         <w:ind w:left="2880" w:hanging="360"/>
@@ -7369,7 +7371,7 @@
     <w:lvl w:ilvl="4">
       <w:start w:val="1"/>
       <w:numFmt w:val="bullet"/>
-      <w:lvlText w:val="○"/>
+      <w:lvlText w:val="•"/>
       <w:lvlJc w:val="left"/>
       <w:pPr>
         <w:ind w:left="3600" w:hanging="360"/>
@@ -7381,7 +7383,7 @@
     <w:lvl w:ilvl="5">
       <w:start w:val="1"/>
       <w:numFmt w:val="bullet"/>
-      <w:lvlText w:val="■"/>
+      <w:lvlText w:val="•"/>
       <w:lvlJc w:val="left"/>
       <w:pPr>
         <w:ind w:left="4320" w:hanging="360"/>
@@ -7393,7 +7395,7 @@
     <w:lvl w:ilvl="6">
       <w:start w:val="1"/>
       <w:numFmt w:val="bullet"/>
-      <w:lvlText w:val="●"/>
+      <w:lvlText w:val="•"/>
       <w:lvlJc w:val="left"/>
       <w:pPr>
         <w:ind w:left="5040" w:hanging="360"/>
@@ -7405,7 +7407,7 @@
     <w:lvl w:ilvl="7">
       <w:start w:val="1"/>
       <w:numFmt w:val="bullet"/>
-      <w:lvlText w:val="○"/>
+      <w:lvlText w:val="•"/>
       <w:lvlJc w:val="left"/>
       <w:pPr>
         <w:ind w:left="5760" w:hanging="360"/>
@@ -7417,7 +7419,7 @@
     <w:lvl w:ilvl="8">
       <w:start w:val="1"/>
       <w:numFmt w:val="bullet"/>
-      <w:lvlText w:val="■"/>
+      <w:lvlText w:val="•"/>
       <w:lvlJc w:val="left"/>
       <w:pPr>
         <w:ind w:left="6480" w:hanging="360"/>
@@ -7431,13 +7433,13 @@
     <w:lvl w:ilvl="0">
       <w:start w:val="0"/>
       <w:numFmt w:val="bullet"/>
-      <w:lvlText w:val="●"/>
+      <w:lvlText w:val="•"/>
       <w:lvlJc w:val="left"/>
       <w:pPr>
         <w:ind w:left="1080" w:hanging="360"/>
       </w:pPr>
       <w:rPr>
-        <w:rFonts w:ascii="Noto Sans Symbols" w:cs="Noto Sans Symbols" w:eastAsia="Noto Sans Symbols" w:hAnsi="Noto Sans Symbols"/>
+        <w:rFonts w:ascii="Candara" w:cs="Candara" w:eastAsia="Candara" w:hAnsi="Candara"/>
         <w:b w:val="1"/>
         <w:bCs w:val="1"/>
       </w:rPr>
@@ -7451,31 +7453,31 @@
         <w:ind w:left="1800" w:hanging="360"/>
       </w:pPr>
       <w:rPr>
-        <w:rFonts w:ascii="Courier New" w:cs="Courier New" w:eastAsia="Courier New" w:hAnsi="Courier New"/>
+        <w:rFonts w:ascii="Candara" w:cs="Candara" w:eastAsia="Candara" w:hAnsi="Candara"/>
       </w:rPr>
     </w:lvl>
     <w:lvl w:ilvl="2">
       <w:start w:val="1"/>
       <w:numFmt w:val="bullet"/>
-      <w:lvlText w:val="▪"/>
+      <w:lvlText w:val="•"/>
       <w:lvlJc w:val="left"/>
       <w:pPr>
         <w:ind w:left="2520" w:hanging="360"/>
       </w:pPr>
       <w:rPr>
-        <w:rFonts w:ascii="Noto Sans Symbols" w:cs="Noto Sans Symbols" w:eastAsia="Noto Sans Symbols" w:hAnsi="Noto Sans Symbols"/>
+        <w:rFonts w:ascii="Candara" w:cs="Candara" w:eastAsia="Candara" w:hAnsi="Candara"/>
       </w:rPr>
     </w:lvl>
     <w:lvl w:ilvl="3">
       <w:start w:val="1"/>
       <w:numFmt w:val="bullet"/>
-      <w:lvlText w:val="●"/>
+      <w:lvlText w:val="•"/>
       <w:lvlJc w:val="left"/>
       <w:pPr>
         <w:ind w:left="3240" w:hanging="360"/>
       </w:pPr>
       <w:rPr>
-        <w:rFonts w:ascii="Noto Sans Symbols" w:cs="Noto Sans Symbols" w:eastAsia="Noto Sans Symbols" w:hAnsi="Noto Sans Symbols"/>
+        <w:rFonts w:ascii="Candara" w:cs="Candara" w:eastAsia="Candara" w:hAnsi="Candara"/>
       </w:rPr>
     </w:lvl>
     <w:lvl w:ilvl="4">
@@ -7487,31 +7489,31 @@
         <w:ind w:left="3960" w:hanging="360"/>
       </w:pPr>
       <w:rPr>
-        <w:rFonts w:ascii="Courier New" w:cs="Courier New" w:eastAsia="Courier New" w:hAnsi="Courier New"/>
+        <w:rFonts w:ascii="Candara" w:cs="Candara" w:eastAsia="Candara" w:hAnsi="Candara"/>
       </w:rPr>
     </w:lvl>
     <w:lvl w:ilvl="5">
       <w:start w:val="1"/>
       <w:numFmt w:val="bullet"/>
-      <w:lvlText w:val="▪"/>
+      <w:lvlText w:val="•"/>
       <w:lvlJc w:val="left"/>
       <w:pPr>
         <w:ind w:left="4680" w:hanging="360"/>
       </w:pPr>
       <w:rPr>
-        <w:rFonts w:ascii="Noto Sans Symbols" w:cs="Noto Sans Symbols" w:eastAsia="Noto Sans Symbols" w:hAnsi="Noto Sans Symbols"/>
+        <w:rFonts w:ascii="Candara" w:cs="Candara" w:eastAsia="Candara" w:hAnsi="Candara"/>
       </w:rPr>
     </w:lvl>
     <w:lvl w:ilvl="6">
       <w:start w:val="1"/>
       <w:numFmt w:val="bullet"/>
-      <w:lvlText w:val="●"/>
+      <w:lvlText w:val="•"/>
       <w:lvlJc w:val="left"/>
       <w:pPr>
         <w:ind w:left="5400" w:hanging="360"/>
       </w:pPr>
       <w:rPr>
-        <w:rFonts w:ascii="Noto Sans Symbols" w:cs="Noto Sans Symbols" w:eastAsia="Noto Sans Symbols" w:hAnsi="Noto Sans Symbols"/>
+        <w:rFonts w:ascii="Candara" w:cs="Candara" w:eastAsia="Candara" w:hAnsi="Candara"/>
       </w:rPr>
     </w:lvl>
     <w:lvl w:ilvl="7">
@@ -7523,19 +7525,19 @@
         <w:ind w:left="6120" w:hanging="360"/>
       </w:pPr>
       <w:rPr>
-        <w:rFonts w:ascii="Courier New" w:cs="Courier New" w:eastAsia="Courier New" w:hAnsi="Courier New"/>
+        <w:rFonts w:ascii="Candara" w:cs="Candara" w:eastAsia="Candara" w:hAnsi="Candara"/>
       </w:rPr>
     </w:lvl>
     <w:lvl w:ilvl="8">
       <w:start w:val="1"/>
       <w:numFmt w:val="bullet"/>
-      <w:lvlText w:val="▪"/>
+      <w:lvlText w:val="•"/>
       <w:lvlJc w:val="left"/>
       <w:pPr>
         <w:ind w:left="6840" w:hanging="360"/>
       </w:pPr>
       <w:rPr>
-        <w:rFonts w:ascii="Noto Sans Symbols" w:cs="Noto Sans Symbols" w:eastAsia="Noto Sans Symbols" w:hAnsi="Noto Sans Symbols"/>
+        <w:rFonts w:ascii="Candara" w:cs="Candara" w:eastAsia="Candara" w:hAnsi="Candara"/>
       </w:rPr>
     </w:lvl>
   </w:abstractNum>
@@ -7653,7 +7655,7 @@
     <w:lvl w:ilvl="0">
       <w:start w:val="1"/>
       <w:numFmt w:val="bullet"/>
-      <w:lvlText w:val="●"/>
+      <w:lvlText w:val="•"/>
       <w:lvlJc w:val="left"/>
       <w:pPr>
         <w:ind w:left="720" w:hanging="360"/>
@@ -7665,7 +7667,7 @@
     <w:lvl w:ilvl="1">
       <w:start w:val="1"/>
       <w:numFmt w:val="bullet"/>
-      <w:lvlText w:val="○"/>
+      <w:lvlText w:val="•"/>
       <w:lvlJc w:val="left"/>
       <w:pPr>
         <w:ind w:left="1440" w:hanging="360"/>
@@ -7677,7 +7679,7 @@
     <w:lvl w:ilvl="2">
       <w:start w:val="1"/>
       <w:numFmt w:val="bullet"/>
-      <w:lvlText w:val="■"/>
+      <w:lvlText w:val="•"/>
       <w:lvlJc w:val="left"/>
       <w:pPr>
         <w:ind w:left="2160" w:hanging="360"/>
@@ -7689,7 +7691,7 @@
     <w:lvl w:ilvl="3">
       <w:start w:val="1"/>
       <w:numFmt w:val="bullet"/>
-      <w:lvlText w:val="●"/>
+      <w:lvlText w:val="•"/>
       <w:lvlJc w:val="left"/>
       <w:pPr>
         <w:ind w:left="2880" w:hanging="360"/>
@@ -7701,7 +7703,7 @@
     <w:lvl w:ilvl="4">
       <w:start w:val="1"/>
       <w:numFmt w:val="bullet"/>
-      <w:lvlText w:val="○"/>
+      <w:lvlText w:val="•"/>
       <w:lvlJc w:val="left"/>
       <w:pPr>
         <w:ind w:left="3600" w:hanging="360"/>
@@ -7713,7 +7715,7 @@
     <w:lvl w:ilvl="5">
       <w:start w:val="1"/>
       <w:numFmt w:val="bullet"/>
-      <w:lvlText w:val="■"/>
+      <w:lvlText w:val="•"/>
       <w:lvlJc w:val="left"/>
       <w:pPr>
         <w:ind w:left="4320" w:hanging="360"/>
@@ -7725,7 +7727,7 @@
     <w:lvl w:ilvl="6">
       <w:start w:val="1"/>
       <w:numFmt w:val="bullet"/>
-      <w:lvlText w:val="●"/>
+      <w:lvlText w:val="•"/>
       <w:lvlJc w:val="left"/>
       <w:pPr>
         <w:ind w:left="5040" w:hanging="360"/>
@@ -7737,7 +7739,7 @@
     <w:lvl w:ilvl="7">
       <w:start w:val="1"/>
       <w:numFmt w:val="bullet"/>
-      <w:lvlText w:val="○"/>
+      <w:lvlText w:val="•"/>
       <w:lvlJc w:val="left"/>
       <w:pPr>
         <w:ind w:left="5760" w:hanging="360"/>
@@ -7749,7 +7751,7 @@
     <w:lvl w:ilvl="8">
       <w:start w:val="1"/>
       <w:numFmt w:val="bullet"/>
-      <w:lvlText w:val="■"/>
+      <w:lvlText w:val="•"/>
       <w:lvlJc w:val="left"/>
       <w:pPr>
         <w:ind w:left="6480" w:hanging="360"/>
@@ -7763,7 +7765,7 @@
     <w:lvl w:ilvl="0">
       <w:start w:val="1"/>
       <w:numFmt w:val="bullet"/>
-      <w:lvlText w:val="●"/>
+      <w:lvlText w:val="•"/>
       <w:lvlJc w:val="left"/>
       <w:pPr>
         <w:ind w:left="720" w:hanging="360"/>
@@ -7775,7 +7777,7 @@
     <w:lvl w:ilvl="1">
       <w:start w:val="1"/>
       <w:numFmt w:val="bullet"/>
-      <w:lvlText w:val="○"/>
+      <w:lvlText w:val="•"/>
       <w:lvlJc w:val="left"/>
       <w:pPr>
         <w:ind w:left="1440" w:hanging="360"/>
@@ -7787,7 +7789,7 @@
     <w:lvl w:ilvl="2">
       <w:start w:val="1"/>
       <w:numFmt w:val="bullet"/>
-      <w:lvlText w:val="■"/>
+      <w:lvlText w:val="•"/>
       <w:lvlJc w:val="left"/>
       <w:pPr>
         <w:ind w:left="2160" w:hanging="360"/>
@@ -7799,7 +7801,7 @@
     <w:lvl w:ilvl="3">
       <w:start w:val="1"/>
       <w:numFmt w:val="bullet"/>
-      <w:lvlText w:val="●"/>
+      <w:lvlText w:val="•"/>
       <w:lvlJc w:val="left"/>
       <w:pPr>
         <w:ind w:left="2880" w:hanging="360"/>
@@ -7811,7 +7813,7 @@
     <w:lvl w:ilvl="4">
       <w:start w:val="1"/>
       <w:numFmt w:val="bullet"/>
-      <w:lvlText w:val="○"/>
+      <w:lvlText w:val="•"/>
       <w:lvlJc w:val="left"/>
       <w:pPr>
         <w:ind w:left="3600" w:hanging="360"/>
@@ -7823,7 +7825,7 @@
     <w:lvl w:ilvl="5">
       <w:start w:val="1"/>
       <w:numFmt w:val="bullet"/>
-      <w:lvlText w:val="■"/>
+      <w:lvlText w:val="•"/>
       <w:lvlJc w:val="left"/>
       <w:pPr>
         <w:ind w:left="4320" w:hanging="360"/>
@@ -7835,7 +7837,7 @@
     <w:lvl w:ilvl="6">
       <w:start w:val="1"/>
       <w:numFmt w:val="bullet"/>
-      <w:lvlText w:val="●"/>
+      <w:lvlText w:val="•"/>
       <w:lvlJc w:val="left"/>
       <w:pPr>
         <w:ind w:left="5040" w:hanging="360"/>
@@ -7847,7 +7849,7 @@
     <w:lvl w:ilvl="7">
       <w:start w:val="1"/>
       <w:numFmt w:val="bullet"/>
-      <w:lvlText w:val="○"/>
+      <w:lvlText w:val="•"/>
       <w:lvlJc w:val="left"/>
       <w:pPr>
         <w:ind w:left="5760" w:hanging="360"/>
@@ -7859,7 +7861,7 @@
     <w:lvl w:ilvl="8">
       <w:start w:val="1"/>
       <w:numFmt w:val="bullet"/>
-      <w:lvlText w:val="■"/>
+      <w:lvlText w:val="•"/>
       <w:lvlJc w:val="left"/>
       <w:pPr>
         <w:ind w:left="6480" w:hanging="360"/>
@@ -7904,7 +7906,7 @@
   <w:docDefaults>
     <w:rPrDefault>
       <w:rPr>
-        <w:rFonts w:ascii="Aptos" w:cs="Aptos" w:eastAsia="Aptos" w:hAnsi="Aptos"/>
+        <w:rFonts w:ascii="Candara" w:cs="Candara" w:eastAsia="Candara" w:hAnsi="Candara"/>
         <w:sz w:val="22"/>
         <w:szCs w:val="22"/>
         <w:lang w:val="fr"/>

</xml_diff>